<commit_message>
Adopt style-based auto numbering for references; strip literal [n] prefixes on render
- thesis23e_engine: reference entries drop the leading "[n] " before rendering —
  numbering is carried by the MBA论文参考文献 style numbering ([%1])
- docx_postprocess: stop removing numPr from the reference style (the old fix
  erased auto numbering set up in Word)
- section_replacer.norm: strip leading "[n] " list markers so md (with literal
  numbers) and docx (auto-numbered) compare equal in diff and text checks
- template: reference style carries the numbering reference (numId 2, [%1])
  with hanging indents; fonts/spacing unchanged
- SKILL.md / README.md updated accordingly

Co-Authored-By: Claude Code <noreply@anthropic.com>
</commit_message>
<xml_diff>
--- a/assets/MBA学位论文模板格式（23E自制）.docx
+++ b/assets/MBA学位论文模板格式（23E自制）.docx
@@ -16267,8 +16267,12 @@
     <w:qFormat/>
     <w:uiPriority w:val="0"/>
     <w:pPr>
+      <w:numPr>
+        <w:ilvl w:val="0"/>
+        <w:numId w:val="2"/>
+      </w:numPr>
       <w:spacing w:line="400" w:lineRule="atLeast"/>
-      <w:ind w:left="0" w:firstLine="0"/>
+      <w:ind w:left="704" w:hanging="420"/>
     </w:pPr>
     <w:rPr>
       <w:rFonts w:cs="Times New Roman"/>

</xml_diff>